<commit_message>
Add Northbridge PDF exports, standardize artifact structure, remove prep guides from public repo
</commit_message>
<xml_diff>
--- a/05-halcyon-ai-governance/artifacts/ai_governance_decision_memo.docx
+++ b/05-halcyon-ai-governance/artifacts/ai_governance_decision_memo.docx
@@ -46,7 +46,7 @@
           <w:sz w:val="20"/>
           <w:szCs w:val="20"/>
         </w:rPr>
-        <w:t xml:space="preserve">To: Executive Leadership Team | From: GRC Lead, with General Counsel and CISO | Date: 2026-07-29</w:t>
+        <w:t xml:space="preserve">To: Executive Leadership Team | From: GRC Lead, with General Counsel and CISO | Date: 2026-08-05</w:t>
       </w:r>
     </w:p>
     <w:p>
@@ -84,7 +84,7 @@
         <w:spacing w:after="160"/>
       </w:pPr>
       <w:r>
-        <w:t xml:space="preserve">Leadership is asked to make three decisions by 31 August 2026:</w:t>
+        <w:t xml:space="preserve">Leadership is asked to make three decisions by 30 September 2026:</w:t>
       </w:r>
     </w:p>
     <w:p>
@@ -175,7 +175,7 @@
           <w:bCs/>
           <w:color w:val="1F3864"/>
         </w:rPr>
-        <w:t xml:space="preserve">On the timeline</w:t>
+        <w:t xml:space="preserve">On the timeline — what changed last week</w:t>
       </w:r>
     </w:p>
     <w:p>
@@ -183,7 +183,54 @@
         <w:spacing w:after="160"/>
       </w:pPr>
       <w:r>
-        <w:t xml:space="preserve">EU AI Act high-risk obligations were scheduled to apply from 2 August 2026. A May 2026 proposal, the Digital Omnibus, would defer that to 2 December 2027 for standalone systems. As of this memo the deferral is proposed and not adopted. Two observations. First, planning to the later date and being wrong is materially costlier than planning to the earlier date and having slack. Second, and more important: the deferral changes when enforcement begins, not whether the systems are causing harm now. AIR-001 — the risk that ClaimSight encodes historical bias in denial recommendations — does not have a compliance date. It is either happening or it isn't, and we currently do not know which.</w:t>
+        <w:t xml:space="preserve">The Digital Omnibus on AI (Regulation (EU) 2026/1744) was published in the Official Journal on 24 July 2026 and entered into force on 27 July 2026, six days before the AI Act's original high-risk deadline. Standalone Annex III high-risk obligations now apply from 2 December 2027; high-risk AI embedded in regulated products from 2 August 2028.</w:t>
+      </w:r>
+    </w:p>
+    <w:p>
+      <w:pPr>
+        <w:spacing w:after="160"/>
+      </w:pPr>
+      <w:r>
+        <w:t xml:space="preserve">That is sixteen additional months, and it materially changes the cost of Option A below. It should not change our posture, for three reasons.</w:t>
+      </w:r>
+    </w:p>
+    <w:p>
+      <w:pPr>
+        <w:pStyle w:val="ListParagraph"/>
+        <w:numPr>
+          <w:ilvl w:val="0"/>
+          <w:numId w:val="3"/>
+        </w:numPr>
+        <w:spacing w:after="80"/>
+      </w:pPr>
+      <w:r>
+        <w:t xml:space="preserve">The deferral is selective. Article 50 transparency duties were expressly NOT deferred and applied from 2 August 2026. Our member chatbot does not meet them today. That obligation is live and we are already past it — it is the only item in this memo with a deadline in the past.</w:t>
+      </w:r>
+    </w:p>
+    <w:p>
+      <w:pPr>
+        <w:pStyle w:val="ListParagraph"/>
+        <w:numPr>
+          <w:ilvl w:val="0"/>
+          <w:numId w:val="3"/>
+        </w:numPr>
+        <w:spacing w:after="80"/>
+      </w:pPr>
+      <w:r>
+        <w:t xml:space="preserve">Deadlines govern enforcement, not harm. AIR-001 is the risk that ClaimSight encodes historical bias into denial recommendations. It has no compliance date. The model either discriminates or it does not, and we currently cannot say which. A member denied benefits in 2026 is not helped by a 2027 deadline.</w:t>
+      </w:r>
+    </w:p>
+    <w:p>
+      <w:pPr>
+        <w:pStyle w:val="ListParagraph"/>
+        <w:numPr>
+          <w:ilvl w:val="0"/>
+          <w:numId w:val="3"/>
+        </w:numPr>
+        <w:spacing w:after="80"/>
+      </w:pPr>
+      <w:r>
+        <w:t xml:space="preserve">Sixteen months is one procurement cycle plus one remediation cycle. Organizations that read 'deferred' as 'resolved' will arrive at December 2027 in exactly the position they are in now. The runway is the opportunity, not the reprieve.</w:t>
       </w:r>
     </w:p>
     <w:p>
@@ -284,7 +331,7 @@
                 <w:sz w:val="18"/>
                 <w:szCs w:val="18"/>
               </w:rPr>
-              <w:t xml:space="preserve">Why it is high-risk</w:t>
+              <w:t xml:space="preserve">Classification</w:t>
             </w:r>
           </w:p>
         </w:tc>
@@ -307,7 +354,7 @@
                 <w:sz w:val="18"/>
                 <w:szCs w:val="18"/>
               </w:rPr>
-              <w:t xml:space="preserve">Access to essential private services (Annex III). Materially influences benefit outcomes for individuals. Three EU-based client plans in scope.</w:t>
+              <w:t xml:space="preserve">CONTESTED. Annex III(5)(a) covers essential public assistance benefits administered by public authorities — we are a private administrator. Annex III(5)(c) covers risk assessment and pricing for life and health insurance — this is claims adjudication, not pricing. Counsel determination required. Treated as high-risk pending that answer.</w:t>
             </w:r>
           </w:p>
         </w:tc>
@@ -451,12 +498,20 @@
                 <w:sz w:val="18"/>
                 <w:szCs w:val="18"/>
               </w:rPr>
-              <w:t xml:space="preserve">Critical (AIR-004). Controls reduce bias and drift risk; they do not resolve the regulatory position for the EU plans.</w:t>
+              <w:t xml:space="preserve">Critical (AIR-004) if high-risk; High if not. Either way the fairness and explainability gaps stand on their own merits.</w:t>
             </w:r>
           </w:p>
         </w:tc>
       </w:tr>
     </w:tbl>
+    <w:p>
+      <w:pPr>
+        <w:spacing w:after="160"/>
+      </w:pPr>
+      <w:r>
+        <w:t xml:space="preserve">Because classification is unsettled, the options below are framed to work under either outcome. That is deliberate: we should not defer action for three months waiting for a legal answer that changes the deadline but not the underlying exposure.</w:t>
+      </w:r>
+    </w:p>
     <w:p>
       <w:pPr>
         <w:pStyle w:val="Heading2"/>
@@ -628,7 +683,7 @@
                 <w:sz w:val="18"/>
                 <w:szCs w:val="18"/>
               </w:rPr>
-              <w:t xml:space="preserve">Right long-term answer if the EU book is strategic. Cost is high (est. 9–12 months, dedicated data science + legal effort). Requires the deferral to hold to be comfortably achievable; if it doesn't, we are non-compliant in production for months.</w:t>
+              <w:t xml:space="preserve">Right long-term answer if the EU book is strategic AND counsel confirms high-risk status. Cost is high (est. 9–12 months). The Omnibus deferral to 2 Dec 2027 makes this comfortably achievable on the calendar, which was not true a month ago. Premature if classification is not yet settled.</w:t>
             </w:r>
           </w:p>
         </w:tc>
@@ -700,7 +755,7 @@
                 <w:sz w:val="18"/>
                 <w:szCs w:val="18"/>
               </w:rPr>
-              <w:t xml:space="preserve">Removes the acute regulatory exposure now. Costs ~2.5 FTE in adjudication capacity for EU plans (roughly 4% of claim volume). Buys time to do Option A properly. Does not remove the underlying fairness risk for US plans — that work must proceed regardless.</w:t>
+              <w:t xml:space="preserve">Removes regulatory exposure regardless of how classification resolves. Costs ~2.5 FTE for EU plans (roughly 4% of claim volume). With the deferral now law, the case for this is weaker than it was — there is time to determine classification first rather than absorbing cost pre-emptively.</w:t>
             </w:r>
           </w:p>
         </w:tc>
@@ -842,7 +897,7 @@
                 <w:sz w:val="18"/>
                 <w:szCs w:val="18"/>
               </w:rPr>
-              <w:t xml:space="preserve">Rejected. Bets the company's regulatory position on a proposal, and ignores that the fairness risk exists independent of the calendar.</w:t>
+              <w:t xml:space="preserve">Superseded. The Omnibus is adopted; there is no longer a pending text to wait on. The live question is classification, not the calendar.</w:t>
             </w:r>
           </w:p>
         </w:tc>
@@ -859,7 +914,7 @@
           <w:bCs/>
           <w:color w:val="1F3864"/>
         </w:rPr>
-        <w:t xml:space="preserve">Recommendation: Option B, with Option A as the committed follow-on</w:t>
+        <w:t xml:space="preserve">Recommendation: Obtain the classification determination; begin fairness work now; hold Option B in reserve</w:t>
       </w:r>
     </w:p>
     <w:p>
@@ -867,7 +922,7 @@
         <w:spacing w:after="160"/>
       </w:pPr>
       <w:r>
-        <w:t xml:space="preserve">Carve EU plans out to manual adjudication within 30 days. Simultaneously begin the fairness testing (AIR-001), explainability (AIR-002), and drift monitoring (AIR-003) work for the US deployment — that work is required on its merits and is also the bulk of the conformity path. Set a checkpoint at 90 days to decide whether to commit to full EU conformity (Option A) or hold EU plans on manual adjudication indefinitely.</w:t>
+        <w:t xml:space="preserve">Instruct counsel to determine Annex III applicability by 30 September 2026. In parallel, and without waiting for that answer, begin fairness testing (AIR-001), explainability (AIR-002), and drift monitoring (AIR-003) on the US deployment. That work is required on its merits, is the bulk of any conformity path, and is the only way to answer whether the system is currently causing harm.</w:t>
       </w:r>
     </w:p>
     <w:p>
@@ -875,7 +930,15 @@
         <w:spacing w:after="160"/>
       </w:pPr>
       <w:r>
-        <w:t xml:space="preserve">The reasoning: B is reversible and A is not. B costs adjudication capacity for a quarter; A costs a year of effort that could be wasted if the deferral collapses the timeline or if fairness testing reveals the model needs to be rebuilt. Take the reversible action first, learn from the fairness results, then commit.</w:t>
+        <w:t xml:space="preserve">The reasoning has two parts. First, sequencing: fairness testing is required whether or not the system is high-risk, and its results determine whether Option A is even viable — if the model needs rebuilding, a conformity package built around it is wasted work. Do the thing that informs the decision before making the decision.</w:t>
+      </w:r>
+    </w:p>
+    <w:p>
+      <w:pPr>
+        <w:spacing w:after="160"/>
+      </w:pPr>
+      <w:r>
+        <w:t xml:space="preserve">Second, proportionality. Before 27 July, carving out the EU plans immediately was the right call because the deadline was six days away and the deferral was speculative. That urgency is gone. Absorbing 2.5 FTE of manual adjudication cost now, before we know whether the classification even applies, would be paying an insurance premium against a risk we have sixteen months to assess. Option B stays on the table as the fallback if counsel confirms high-risk status and fairness testing comes back poorly.</w:t>
       </w:r>
     </w:p>
     <w:p>
@@ -1168,7 +1231,7 @@
         <w:spacing w:after="160"/>
       </w:pPr>
       <w:r>
-        <w:t xml:space="preserve">Pause immediately — this is a pilot, so pausing costs little. Notify the vendor in writing that resumption requires (a) a third-party bias audit report meeting NYC Local Law 144 standards, and (b) transparency documentation sufficient for EU AI Act Article 13. Give them 60 days. If they can't or won't provide it, terminate and evaluate alternatives that can.</w:t>
+        <w:t xml:space="preserve">Pause immediately — this is a pilot, so pausing costs little. Notify the vendor in writing that resumption requires (a) a third-party bias audit report meeting NYC Local Law 144 standards, and (b) transparency documentation sufficient for EU AI Act Article 13. Give them 60 days. If they can't or won't provide it, terminate and evaluate alternatives that can. Note that unlike ClaimSight, this classification is not in doubt — Annex III(4)(a) names recruitment and candidate evaluation explicitly — and NYC Local Law 144 applies on its own timeline with no dependency on the EU deferral.</w:t>
       </w:r>
     </w:p>
     <w:p>
@@ -1483,7 +1546,7 @@
                 <w:sz w:val="18"/>
                 <w:szCs w:val="18"/>
               </w:rPr>
-              <w:t xml:space="preserve">Approve carve-out of EU plans from ClaimSight to manual adjudication; fund fairness/explainability/drift work for US deployment; 90-day checkpoint on full EU conformity</w:t>
+              <w:t xml:space="preserve">Instruct counsel on ClaimSight Annex III determination; fund fairness/explainability/drift work to begin immediately; hold EU carve-out in reserve</w:t>
             </w:r>
           </w:p>
         </w:tc>
@@ -1529,7 +1592,7 @@
                 <w:sz w:val="18"/>
                 <w:szCs w:val="18"/>
               </w:rPr>
-              <w:t xml:space="preserve">2026-08-31</w:t>
+              <w:t xml:space="preserve">2026-09-30</w:t>
             </w:r>
           </w:p>
         </w:tc>
@@ -1743,6 +1806,100 @@
                 <w:szCs w:val="18"/>
               </w:rPr>
               <w:t xml:space="preserve">4</w:t>
+            </w:r>
+          </w:p>
+        </w:tc>
+        <w:tc>
+          <w:tcPr>
+            <w:tcW w:type="dxa" w:w="4600"/>
+            <w:tcMar>
+              <w:top w:type="dxa" w:w="80"/>
+              <w:left w:type="dxa" w:w="100"/>
+              <w:bottom w:type="dxa" w:w="80"/>
+              <w:right w:type="dxa" w:w="100"/>
+            </w:tcMar>
+          </w:tcPr>
+          <w:p>
+            <w:r>
+              <w:rPr>
+                <w:b w:val="false"/>
+                <w:bCs w:val="false"/>
+                <w:color w:val="000000"/>
+                <w:sz w:val="18"/>
+                <w:szCs w:val="18"/>
+              </w:rPr>
+              <w:t xml:space="preserve">Deploy chatbot AI disclosure — Art. 50 obligation already past deadline</w:t>
+            </w:r>
+          </w:p>
+        </w:tc>
+        <w:tc>
+          <w:tcPr>
+            <w:tcW w:type="dxa" w:w="2000"/>
+            <w:tcMar>
+              <w:top w:type="dxa" w:w="80"/>
+              <w:left w:type="dxa" w:w="100"/>
+              <w:bottom w:type="dxa" w:w="80"/>
+              <w:right w:type="dxa" w:w="100"/>
+            </w:tcMar>
+          </w:tcPr>
+          <w:p>
+            <w:r>
+              <w:rPr>
+                <w:b w:val="false"/>
+                <w:bCs w:val="false"/>
+                <w:color w:val="000000"/>
+                <w:sz w:val="18"/>
+                <w:szCs w:val="18"/>
+              </w:rPr>
+              <w:t xml:space="preserve">Dir. Member Services</w:t>
+            </w:r>
+          </w:p>
+        </w:tc>
+        <w:tc>
+          <w:tcPr>
+            <w:tcW w:type="dxa" w:w="1750"/>
+            <w:tcMar>
+              <w:top w:type="dxa" w:w="80"/>
+              <w:left w:type="dxa" w:w="100"/>
+              <w:bottom w:type="dxa" w:w="80"/>
+              <w:right w:type="dxa" w:w="100"/>
+            </w:tcMar>
+          </w:tcPr>
+          <w:p>
+            <w:r>
+              <w:rPr>
+                <w:b w:val="false"/>
+                <w:bCs w:val="false"/>
+                <w:color w:val="000000"/>
+                <w:sz w:val="18"/>
+                <w:szCs w:val="18"/>
+              </w:rPr>
+              <w:t xml:space="preserve">2026-08-15</w:t>
+            </w:r>
+          </w:p>
+        </w:tc>
+      </w:tr>
+      <w:tr>
+        <w:tc>
+          <w:tcPr>
+            <w:tcW w:type="dxa" w:w="1000"/>
+            <w:tcMar>
+              <w:top w:type="dxa" w:w="80"/>
+              <w:left w:type="dxa" w:w="100"/>
+              <w:bottom w:type="dxa" w:w="80"/>
+              <w:right w:type="dxa" w:w="100"/>
+            </w:tcMar>
+          </w:tcPr>
+          <w:p>
+            <w:r>
+              <w:rPr>
+                <w:b w:val="false"/>
+                <w:bCs w:val="false"/>
+                <w:color w:val="000000"/>
+                <w:sz w:val="18"/>
+                <w:szCs w:val="18"/>
+              </w:rPr>
+              <w:t xml:space="preserve">5</w:t>
             </w:r>
           </w:p>
         </w:tc>
@@ -1836,7 +1993,7 @@
         <w:spacing w:after="160"/>
       </w:pPr>
       <w:r>
-        <w:t xml:space="preserve">Analysis draws on NIST AI RMF 1.0 and the Generative AI Profile (AI 600-1), ISO/IEC 42001:2023, the EU AI Act as adopted (Regulation (EU) 2024/1689) with the May 2026 Digital Omnibus proposal noted as unadopted, and NYC Local Law 144. This is a portfolio artifact for a fictional company; regulatory citations are for demonstration and would require verification by counsel before reliance in any real decision.</w:t>
+        <w:t xml:space="preserve">Analysis draws on NIST AI RMF 1.0 and the Generative AI Profile (AI 600-1), ISO/IEC 42001:2023, the EU AI Act (Regulation (EU) 2024/1689) as amended by the Digital Omnibus on AI (Regulation (EU) 2026/1744, published in the Official Journal 24 July 2026, in force 27 July 2026), and NYC Local Law 144. This is a portfolio artifact for a fictional company; regulatory citations are for demonstration and would require verification by counsel before reliance in any real decision. Nothing here creates or claims legal privilege.</w:t>
       </w:r>
     </w:p>
     <w:sectPr>
@@ -1904,7 +2061,7 @@
         <w:sz w:val="16"/>
         <w:szCs w:val="16"/>
       </w:rPr>
-      <w:t xml:space="preserve">Confidential — Attorney-Client Privileged Draft  |  Page </w:t>
+      <w:t xml:space="preserve">Confidential — Fictional Executive Decision Memo  |  Page </w:t>
     </w:r>
     <w:r>
       <w:rPr>

</xml_diff>